<commit_message>
Establish Apache core licensing and attribution
</commit_message>
<xml_diff>
--- a/paper/RAGWarrant_Governance.docx
+++ b/paper/RAGWarrant_Governance.docx
@@ -3097,7 +3097,7 @@
           <wp:inline distT="0" distB="0" distL="0" distR="0" wp14:anchorId="779BF95E" wp14:editId="35BA8848">
             <wp:extent cx="5715000" cy="3218181"/>
             <wp:effectExtent l="0" t="0" r="0" b="0"/>
-            <wp:docPr id="4" name="Picture 4" descr="Cloud-agnostic deployment diagram showing policy configurations, datasets, and telemetry entering a hardened RAGTune containerized governance job and producing a promotion decision, audit bundle, and claim-boundary report." title="Cloud-agnostic deployment diagram showing policy configurations, datasets, and telemetry entering a hardened RAGTune con"/>
+            <wp:docPr id="4" name="Picture 4" descr="Cloud-agnostic deployment diagram showing policy configurations, datasets, and telemetry entering a hardened RAGWarrant containerized governance job and producing a promotion decision, audit bundle, and claim-boundary report." title="Cloud-agnostic deployment diagram showing policy configurations, datasets, and telemetry entering a hardened RAGWarrant con"/>
             <wp:cNvGraphicFramePr>
               <a:graphicFrameLocks xmlns:a="http://schemas.openxmlformats.org/drawingml/2006/main" noChangeAspect="1"/>
             </wp:cNvGraphicFramePr>
@@ -10221,7 +10221,7 @@
         <w:rPr>
           <w:sz w:val="16"/>
         </w:rPr>
-        <w:t>/rag-tuning-governance.</w:t>
+        <w:t>/ragwarrant-governance.</w:t>
       </w:r>
     </w:p>
     <w:p>

</xml_diff>